<commit_message>
Set guarantee terms and confirm founder decisions for the prospect pack
- No money-back guarantee; backstop is 3 qualified leads in 30 days, with
  free extended support (not a refund) if the merchant held up their side
- Founding Member promotion stays on; partner price for Agency is R6,999
- Option D (demo on a prospect's public catalogue) approved for every wave
- Checkout fee wording: pass-through, named (Paystack 2.9%+R1 card / 2% EFT)
- Sender identity: Thabo Malebadi, thabo@fluxmuse.com
- VAT: Fluxmuse is not VAT-registered, so no VAT is charged or mentioned
  (overrides the earlier excl.-VAT instruction, which would have been false)
- Rebuilt all 20 proposals, briefs and the list; Outreach_Playbook.md
  pre-flight items marked resolved

Co-Authored-By: Claude Sonnet 5 <noreply@anthropic.com>
</commit_message>
<xml_diff>
--- a/docs/go-to-market/08_Prospects/proposals/01_khuli-chana.docx
+++ b/docs/go-to-market/08_Prospects/proposals/01_khuli-chana.docx
@@ -266,33 +266,9 @@
             </w:pPr>
             <w:r>
               <w:rPr>
-                <w:b/>
-                <w:color w:val="20242B"/>
-                <w:sz w:val="20"/>
-                <w:shd w:val="clear" w:color="auto" w:fill="FFF1A8"/>
-              </w:rPr>
-              <w:t>[[SENDER NAME]]</w:t>
-            </w:r>
-            <w:r>
-              <w:rPr>
                 <w:sz w:val="20"/>
               </w:rPr>
-              <w:t xml:space="preserve">, </w:t>
-            </w:r>
-            <w:r>
-              <w:rPr>
-                <w:b/>
-                <w:color w:val="20242B"/>
-                <w:sz w:val="20"/>
-                <w:shd w:val="clear" w:color="auto" w:fill="FFF1A8"/>
-              </w:rPr>
-              <w:t>[[SENDER TITLE]]</w:t>
-            </w:r>
-            <w:r>
-              <w:rPr>
-                <w:sz w:val="20"/>
-              </w:rPr>
-              <w:t>, Fluxmuse Pty Ltd</w:t>
+              <w:t>Thabo Malebadi, Founder, Fluxmuse Pty Ltd</w:t>
             </w:r>
           </w:p>
           <w:p>
@@ -301,18 +277,9 @@
             </w:pPr>
             <w:r>
               <w:rPr>
-                <w:b/>
-                <w:color w:val="20242B"/>
-                <w:sz w:val="20"/>
-                <w:shd w:val="clear" w:color="auto" w:fill="FFF1A8"/>
-              </w:rPr>
-              <w:t>[[SENDER EMAIL]]</w:t>
-            </w:r>
-            <w:r>
-              <w:rPr>
                 <w:sz w:val="20"/>
               </w:rPr>
-              <w:t xml:space="preserve"> · </w:t>
+              <w:t xml:space="preserve">thabo@fluxmuse.com · </w:t>
             </w:r>
             <w:r>
               <w:rPr>
@@ -382,23 +349,7 @@
           <w:color w:val="5B6570"/>
           <w:sz w:val="17"/>
         </w:rPr>
-        <w:t xml:space="preserve">Confidential. Prepared for Khuli Chana only. Prices are in South African rand (ZAR). VAT treatment: </w:t>
-      </w:r>
-      <w:r>
-        <w:rPr>
-          <w:b/>
-          <w:color w:val="20242B"/>
-          <w:sz w:val="17"/>
-          <w:shd w:val="clear" w:color="auto" w:fill="FFF1A8"/>
-        </w:rPr>
-        <w:t>[[CONFIRM VAT TREATMENT]]</w:t>
-      </w:r>
-      <w:r>
-        <w:rPr>
-          <w:color w:val="5B6570"/>
-          <w:sz w:val="17"/>
-        </w:rPr>
-        <w:t>.</w:t>
+        <w:t>Confidential. Prepared for Khuli Chana only. Prices are in South African rand (ZAR). Fluxmuse Pty Ltd is not VAT-registered, so no VAT is added to these prices.</w:t>
       </w:r>
     </w:p>
     <w:p>
@@ -2548,16 +2499,7 @@
               <w:rPr>
                 <w:sz w:val="19"/>
               </w:rPr>
-              <w:t xml:space="preserve">Payment is taken first, when you subscribe. </w:t>
-            </w:r>
-            <w:r>
-              <w:rPr>
-                <w:b/>
-                <w:color w:val="20242B"/>
-                <w:sz w:val="19"/>
-                <w:shd w:val="clear" w:color="auto" w:fill="FFF1A8"/>
-              </w:rPr>
-              <w:t>[[GUARANTEE TERMS: money-back guarantee, terms to be confirmed by the founder]]</w:t>
+              <w:t>Payment is taken first, when you subscribe. We back this with 3 qualified leads in your first 30 days, using the lead definition set out below. If you hold up your side (share the link, post about it weekly) and fewer than 3 arrive, we keep working with you at no extra cost until you have 3.</w:t>
             </w:r>
           </w:p>
         </w:tc>
@@ -2598,16 +2540,7 @@
               <w:rPr>
                 <w:sz w:val="19"/>
               </w:rPr>
-              <w:t xml:space="preserve">30% off your first two monthly billing cycles is applied at checkout while the offer is open. </w:t>
-            </w:r>
-            <w:r>
-              <w:rPr>
-                <w:b/>
-                <w:color w:val="20242B"/>
-                <w:sz w:val="19"/>
-                <w:shd w:val="clear" w:color="auto" w:fill="FFF1A8"/>
-              </w:rPr>
-              <w:t>[[CONFIRM the offer is still active before sending]]</w:t>
+              <w:t>30% off your first two monthly billing cycles is applied at checkout while the offer is open.</w:t>
             </w:r>
           </w:p>
         </w:tc>
@@ -2665,23 +2598,7 @@
           <w:color w:val="5B6570"/>
           <w:sz w:val="17"/>
         </w:rPr>
-        <w:t xml:space="preserve">Prices are in South African rand (ZAR). VAT treatment: </w:t>
-      </w:r>
-      <w:r>
-        <w:rPr>
-          <w:b/>
-          <w:color w:val="20242B"/>
-          <w:sz w:val="17"/>
-          <w:shd w:val="clear" w:color="auto" w:fill="FFF1A8"/>
-        </w:rPr>
-        <w:t>[[CONFIRM VAT TREATMENT]]</w:t>
-      </w:r>
-      <w:r>
-        <w:rPr>
-          <w:color w:val="5B6570"/>
-          <w:sz w:val="17"/>
-        </w:rPr>
-        <w:t>.</w:t>
+        <w:t>Prices are in South African rand (ZAR). Fluxmuse Pty Ltd is not VAT-registered, so no VAT is added to these prices.</w:t>
       </w:r>
     </w:p>
     <w:p>
@@ -2999,18 +2916,9 @@
             </w:pPr>
             <w:r>
               <w:rPr>
-                <w:b/>
-                <w:color w:val="20242B"/>
-                <w:sz w:val="20"/>
-                <w:shd w:val="clear" w:color="auto" w:fill="FFF1A8"/>
-              </w:rPr>
-              <w:t>[[SENDER NAME]]</w:t>
-            </w:r>
-            <w:r>
-              <w:rPr>
                 <w:sz w:val="20"/>
               </w:rPr>
-              <w:t>, Fluxmuse Pty Ltd</w:t>
+              <w:t>Thabo Malebadi, Fluxmuse Pty Ltd</w:t>
             </w:r>
           </w:p>
         </w:tc>
@@ -3049,12 +2957,9 @@
             </w:pPr>
             <w:r>
               <w:rPr>
-                <w:b/>
-                <w:color w:val="20242B"/>
                 <w:sz w:val="20"/>
-                <w:shd w:val="clear" w:color="auto" w:fill="FFF1A8"/>
               </w:rPr>
-              <w:t>[[SENDER EMAIL]]</w:t>
+              <w:t>thabo@fluxmuse.com</w:t>
             </w:r>
           </w:p>
         </w:tc>

</xml_diff>